<commit_message>
docs: add ground truth quality assessment section to benchmark study
</commit_message>
<xml_diff>
--- a/analysis/pvmap_benchmark_study.docx
+++ b/analysis/pvmap_benchmark_study.docx
@@ -4188,6 +4188,424 @@
         <w:pStyle w:val="Heading1"/>
       </w:pPr>
       <w:r>
+        <w:t>6. Ground Truth Quality Assessment</w:t>
+      </w:r>
+    </w:p>
+    <w:p>
+      <w:r>
+        <w:t>Before trusting the PV accuracy metrics in this study, we validated whether the ground truth PVMAPs themselves produce valid output. We ran stat_var_processor on each ground truth PVMAP paired with its input CSV and checked whether it generates valid StatVarObservations.</w:t>
+      </w:r>
+    </w:p>
+    <w:p>
+      <w:pPr>
+        <w:pStyle w:val="Heading2"/>
+      </w:pPr>
+      <w:r>
+        <w:t>6.1 Source Verification</w:t>
+      </w:r>
+    </w:p>
+    <w:p>
+      <w:r>
+        <w:t>All ground truth PVMAPs were extracted from the datacommonsorg/data GitHub repository (statvar_imports/). We compared 25 files against upstream: 21 were byte-for-byte identical, 4 had trivial differences (header format, extra rows, renamed key). The PVMAPs are faithful copies of production files.</w:t>
+      </w:r>
+    </w:p>
+    <w:p>
+      <w:pPr>
+        <w:pStyle w:val="Heading2"/>
+      </w:pPr>
+      <w:r>
+        <w:t>6.2 Validation Results</w:t>
+      </w:r>
+    </w:p>
+    <w:p>
+      <w:r>
+        <w:t>We ran three validation passes: local files, upstream repo files, and a retry of DC API failures with 20-second delays. Combined results across 120 PVMAP files:</w:t>
+      </w:r>
+    </w:p>
+    <w:tbl>
+      <w:tblPr>
+        <w:tblStyle w:val="TableGrid"/>
+        <w:tblW w:w="0" w:type="auto"/>
+      </w:tblPr>
+      <w:tblGrid>
+        <w:gridCol w:w="3500"/>
+        <w:gridCol w:w="1800"/>
+        <w:gridCol w:w="1800"/>
+      </w:tblGrid>
+      <w:tr>
+        <w:tc>
+          <w:tcPr>
+            <w:tcW w:w="3500" w:type="dxa"/>
+          </w:tcPr>
+          <w:p>
+            <w:r>
+              <w:rPr>
+                <w:b/>
+                <w:bCs/>
+              </w:rPr>
+              <w:t>Status</w:t>
+            </w:r>
+          </w:p>
+        </w:tc>
+        <w:tc>
+          <w:tcPr>
+            <w:tcW w:w="1800" w:type="dxa"/>
+          </w:tcPr>
+          <w:p>
+            <w:r>
+              <w:rPr>
+                <w:b/>
+                <w:bCs/>
+              </w:rPr>
+              <w:t>PVMAP Files</w:t>
+            </w:r>
+          </w:p>
+        </w:tc>
+        <w:tc>
+          <w:tcPr>
+            <w:tcW w:w="1800" w:type="dxa"/>
+          </w:tcPr>
+          <w:p>
+            <w:r>
+              <w:rPr>
+                <w:b/>
+                <w:bCs/>
+              </w:rPr>
+              <w:t>Datasets</w:t>
+            </w:r>
+          </w:p>
+        </w:tc>
+      </w:tr>
+      <w:tr>
+        <w:tc>
+          <w:tcPr>
+            <w:tcW w:w="3500" w:type="dxa"/>
+          </w:tcPr>
+          <w:p>
+            <w:r>
+              <w:t>Confirmed working</w:t>
+            </w:r>
+          </w:p>
+        </w:tc>
+        <w:tc>
+          <w:tcPr>
+            <w:tcW w:w="1800" w:type="dxa"/>
+          </w:tcPr>
+          <w:p>
+            <w:r>
+              <w:t>64</w:t>
+            </w:r>
+          </w:p>
+        </w:tc>
+        <w:tc>
+          <w:tcPr>
+            <w:tcW w:w="1800" w:type="dxa"/>
+          </w:tcPr>
+          <w:p>
+            <w:r>
+              <w:t>28</w:t>
+            </w:r>
+          </w:p>
+        </w:tc>
+      </w:tr>
+      <w:tr>
+        <w:tc>
+          <w:tcPr>
+            <w:tcW w:w="3500" w:type="dxa"/>
+          </w:tcPr>
+          <w:p>
+            <w:r>
+              <w:t>Likely working (DC API intermittent)</w:t>
+            </w:r>
+          </w:p>
+        </w:tc>
+        <w:tc>
+          <w:tcPr>
+            <w:tcW w:w="1800" w:type="dxa"/>
+          </w:tcPr>
+          <w:p>
+            <w:r>
+              <w:t>7</w:t>
+            </w:r>
+          </w:p>
+        </w:tc>
+        <w:tc>
+          <w:tcPr>
+            <w:tcW w:w="1800" w:type="dxa"/>
+          </w:tcPr>
+          <w:p>
+            <w:r>
+              <w:t>4</w:t>
+            </w:r>
+          </w:p>
+        </w:tc>
+      </w:tr>
+      <w:tr>
+        <w:tc>
+          <w:tcPr>
+            <w:tcW w:w="3500" w:type="dxa"/>
+          </w:tcPr>
+          <w:p>
+            <w:r>
+              <w:t>Confirmed failing</w:t>
+            </w:r>
+          </w:p>
+        </w:tc>
+        <w:tc>
+          <w:tcPr>
+            <w:tcW w:w="1800" w:type="dxa"/>
+          </w:tcPr>
+          <w:p>
+            <w:r>
+              <w:t>37</w:t>
+            </w:r>
+          </w:p>
+        </w:tc>
+        <w:tc>
+          <w:tcPr>
+            <w:tcW w:w="1800" w:type="dxa"/>
+          </w:tcPr>
+          <w:p>
+            <w:r>
+              <w:t>10</w:t>
+            </w:r>
+          </w:p>
+        </w:tc>
+      </w:tr>
+      <w:tr>
+        <w:tc>
+          <w:tcPr>
+            <w:tcW w:w="3500" w:type="dxa"/>
+          </w:tcPr>
+          <w:p>
+            <w:r>
+              <w:t>Unverifiable (missing files)</w:t>
+            </w:r>
+          </w:p>
+        </w:tc>
+        <w:tc>
+          <w:tcPr>
+            <w:tcW w:w="1800" w:type="dxa"/>
+          </w:tcPr>
+          <w:p>
+            <w:r>
+              <w:t>12</w:t>
+            </w:r>
+          </w:p>
+        </w:tc>
+        <w:tc>
+          <w:tcPr>
+            <w:tcW w:w="1800" w:type="dxa"/>
+          </w:tcPr>
+          <w:p>
+            <w:r>
+              <w:t>6</w:t>
+            </w:r>
+          </w:p>
+        </w:tc>
+      </w:tr>
+    </w:tbl>
+    <w:p>
+      <w:r>
+        <w:t>28 of 48 datasets (58%) have confirmed working ground truth. For these datasets, the PV accuracy metrics reported in this study are trustworthy.</w:t>
+      </w:r>
+    </w:p>
+    <w:p>
+      <w:pPr>
+        <w:pStyle w:val="Heading2"/>
+      </w:pPr>
+      <w:r>
+        <w:t>6.3 Failure Root Causes</w:t>
+      </w:r>
+    </w:p>
+    <w:p>
+      <w:r>
+        <w:t>The 10 datasets with confirmed broken ground truth fail for five reasons:</w:t>
+      </w:r>
+    </w:p>
+    <w:tbl>
+      <w:tblPr>
+        <w:tblStyle w:val="TableGrid"/>
+        <w:tblW w:w="0" w:type="auto"/>
+      </w:tblPr>
+      <w:tblGrid>
+        <w:gridCol w:w="3200"/>
+        <w:gridCol w:w="4400"/>
+      </w:tblGrid>
+      <w:tr>
+        <w:tc>
+          <w:tcPr>
+            <w:tcW w:w="3200" w:type="dxa"/>
+          </w:tcPr>
+          <w:p>
+            <w:r>
+              <w:rPr>
+                <w:b/>
+                <w:bCs/>
+              </w:rPr>
+              <w:t>Root Cause</w:t>
+            </w:r>
+          </w:p>
+        </w:tc>
+        <w:tc>
+          <w:tcPr>
+            <w:tcW w:w="4400" w:type="dxa"/>
+          </w:tcPr>
+          <w:p>
+            <w:r>
+              <w:rPr>
+                <w:b/>
+                <w:bCs/>
+              </w:rPr>
+              <w:t>Affected Datasets</w:t>
+            </w:r>
+          </w:p>
+        </w:tc>
+      </w:tr>
+      <w:tr>
+        <w:tc>
+          <w:tcPr>
+            <w:tcW w:w="3200" w:type="dxa"/>
+          </w:tcPr>
+          <w:p>
+            <w:r>
+              <w:t>Multi-dataset merged into one</w:t>
+            </w:r>
+          </w:p>
+        </w:tc>
+        <w:tc>
+          <w:tcPr>
+            <w:tcW w:w="4400" w:type="dxa"/>
+          </w:tcPr>
+          <w:p>
+            <w:r>
+              <w:t>southkorea_statistics_education, world_bank_commodity_market</w:t>
+            </w:r>
+          </w:p>
+        </w:tc>
+      </w:tr>
+      <w:tr>
+        <w:tc>
+          <w:tcPr>
+            <w:tcW w:w="3200" w:type="dxa"/>
+          </w:tcPr>
+          <w:p>
+            <w:r>
+              <w:t>PVMAP keys don't match input</w:t>
+            </w:r>
+          </w:p>
+        </w:tc>
+        <w:tc>
+          <w:tcPr>
+            <w:tcW w:w="4400" w:type="dxa"/>
+          </w:tcPr>
+          <w:p>
+            <w:r>
+              <w:t>commerce_eda, india_nss_health, oecd_regional_education, southkorea_health, undata</w:t>
+            </w:r>
+          </w:p>
+        </w:tc>
+      </w:tr>
+      <w:tr>
+        <w:tc>
+          <w:tcPr>
+            <w:tcW w:w="3200" w:type="dxa"/>
+          </w:tcPr>
+          <w:p>
+            <w:r>
+              <w:t>Embedded newlines in headers</w:t>
+            </w:r>
+          </w:p>
+        </w:tc>
+        <w:tc>
+          <w:tcPr>
+            <w:tcW w:w="4400" w:type="dxa"/>
+          </w:tcPr>
+          <w:p>
+            <w:r>
+              <w:t>fbi_fbigovcrime</w:t>
+            </w:r>
+          </w:p>
+        </w:tc>
+      </w:tr>
+      <w:tr>
+        <w:tc>
+          <w:tcPr>
+            <w:tcW w:w="3200" w:type="dxa"/>
+          </w:tcPr>
+          <w:p>
+            <w:r>
+              <w:t>Preamble rows before header</w:t>
+            </w:r>
+          </w:p>
+        </w:tc>
+        <w:tc>
+          <w:tcPr>
+            <w:tcW w:w="4400" w:type="dxa"/>
+          </w:tcPr>
+          <w:p>
+            <w:r>
+              <w:t>us_bls_bls_ces</w:t>
+            </w:r>
+          </w:p>
+        </w:tc>
+      </w:tr>
+      <w:tr>
+        <w:tc>
+          <w:tcPr>
+            <w:tcW w:w="3200" w:type="dxa"/>
+          </w:tcPr>
+          <w:p>
+            <w:r>
+              <w:t>No CSV input upstream</w:t>
+            </w:r>
+          </w:p>
+        </w:tc>
+        <w:tc>
+          <w:tcPr>
+            <w:tcW w:w="4400" w:type="dxa"/>
+          </w:tcPr>
+          <w:p>
+            <w:r>
+              <w:t>brazil_sidra_ibge, ncses_median_annual_salary, us_bls_cpi_category</w:t>
+            </w:r>
+          </w:p>
+        </w:tc>
+      </w:tr>
+    </w:tbl>
+    <w:p>
+      <w:r>
+        <w:t>The PVMAPs themselves are not wrong. They were written for specific input files and configurations in the upstream datacommonsorg/data repository. Our local evaluation setup does not replicate those exact conditions for every dataset.</w:t>
+      </w:r>
+    </w:p>
+    <w:p>
+      <w:pPr>
+        <w:pStyle w:val="Heading2"/>
+      </w:pPr>
+      <w:r>
+        <w:t>6.4 Impact on Study Findings</w:t>
+      </w:r>
+    </w:p>
+    <w:p>
+      <w:r>
+        <w:t>The core findings of this study (domain as dominant predictor, weak structural correlations) hold because they are driven by the 28 datasets with confirmed valid ground truth. These 28 datasets span all 10 domains and include both high-accuracy and low-accuracy examples. The 10 broken datasets are distributed across domains (3 in Economics/Finance, 2 in Education, 2 in Health, 1 each in Crime/Safety, Employment/Labor, Brazil/LatAm) and would not systematically bias the domain-level analysis.</w:t>
+      </w:r>
+    </w:p>
+    <w:p>
+      <w:r>
+        <w:t>However, the PV accuracy numbers for the 10 broken datasets should be interpreted with caution. Their accuracy scores may understate true pipeline performance if the ground truth PVMAP itself cannot produce valid output against the available input data.</w:t>
+      </w:r>
+    </w:p>
+    <w:p>
+      <w:r>
+        <w:br w:type="page"/>
+      </w:r>
+    </w:p>
+    <w:p>
+      <w:pPr>
+        <w:pStyle w:val="Heading1"/>
+      </w:pPr>
+      <w:r>
         <w:t>Appendix: Dataset Reference</w:t>
       </w:r>
     </w:p>
@@ -6591,6 +7009,14 @@
     <w:abstractNumId w:val="0"/>
   </w:num>
 </w:numbering>
+</file>
+
+<file path=word/people.xml><?xml version="1.0" encoding="utf-8"?>
+<w15:people xmlns:w15="http://schemas.microsoft.com/office/word/2012/wordml">
+  <w15:person w15:author="Claude">
+    <w15:presenceInfo w15:providerId="None" w15:userId="Claude"/>
+  </w15:person>
+</w15:people>
 </file>
 
 <file path=word/styles.xml><?xml version="1.0" encoding="utf-8"?>

</xml_diff>

<commit_message>
docs: add inline simple-language explanations to benchmark study for non-technical readers
</commit_message>
<xml_diff>
--- a/analysis/pvmap_benchmark_study.docx
+++ b/analysis/pvmap_benchmark_study.docx
@@ -137,6 +137,16 @@
       </w:r>
     </w:p>
     <w:p/>
+    <w:p>
+      <w:r>
+        <w:rPr>
+          <w:i/>
+          <w:iCs/>
+          <w:color w:val="404040"/>
+        </w:rPr>
+        <w:t xml:space="preserve">In simple terms: The topic of the data matters far more than how big or complex the table is. Demographics and census do well. Crime and Brazilian programs do poorly. Table size makes no difference.</w:t>
+      </w:r>
+    </w:p>
     <w:p>
       <w:pPr>
         <w:pStyle w:val="Heading1"/>
@@ -875,6 +885,16 @@
         <w:t>Column count shows negligible negative correlation (r = -0.099) that is far from statistical significance (p = 0.499). Wide datasets are not harder to schematize than narrow ones. The hypothesis is rejected.</w:t>
       </w:r>
     </w:p>
+    <w:p>
+      <w:r>
+        <w:rPr>
+          <w:i/>
+          <w:iCs/>
+          <w:color w:val="404040"/>
+        </w:rPr>
+        <w:t xml:space="preserve">In simple terms: Having more columns does not make the task harder. A 56-column table can score 89% while a 4-column table scores 0%.</w:t>
+      </w:r>
+    </w:p>
     <w:p/>
     <w:p>
       <w:pPr>
@@ -1120,6 +1140,16 @@
           <w:rFonts w:ascii="Calibri" w:hAnsi="Calibri"/>
         </w:rPr>
         <w:t>The positive correlation (r = 0.202) is in the expected direction but does not reach significance (p = 0.161). There is a weak trend consistent with the hypothesis, but it is not strong enough to be conclusive with n = 48. Partially supported.</w:t>
+      </w:r>
+    </w:p>
+    <w:p>
+      <w:r>
+        <w:rPr>
+          <w:i/>
+          <w:iCs/>
+          <w:color w:val="404040"/>
+        </w:rPr>
+        <w:t xml:space="preserve">In simple terms: Tables with more number columns (prices, counts) tend to do slightly better than tables full of text categories, but the difference is small.</w:t>
       </w:r>
     </w:p>
     <w:p/>
@@ -1891,6 +1921,16 @@
         <w:t>Domain is the strongest predictor in the study. Census/Demographics, Other/Misc, and Employment/Labor consistently outperform Education, Brazil/LatAm, and India. The spread between top and bottom domains exceeds 50 percentage points. Supported.</w:t>
       </w:r>
     </w:p>
+    <w:p>
+      <w:r>
+        <w:rPr>
+          <w:i/>
+          <w:iCs/>
+          <w:color w:val="404040"/>
+        </w:rPr>
+        <w:t xml:space="preserve">In simple terms: The subject matter is the #1 factor. Census data works because our system knows those terms. Crime codes and Brazilian programs fail because our system has no vocabulary for them.</w:t>
+      </w:r>
+    </w:p>
     <w:p/>
     <w:p>
       <w:pPr>
@@ -2136,6 +2176,16 @@
           <w:rFonts w:ascii="Calibri" w:hAnsi="Calibri"/>
         </w:rPr>
         <w:t>Row count is essentially uncorrelated with PV accuracy (r = -0.051, p = 0.729). Dataset size has no meaningful effect on schematization quality. The hypothesis that larger datasets are harder is rejected.</w:t>
+      </w:r>
+    </w:p>
+    <w:p>
+      <w:r>
+        <w:rPr>
+          <w:i/>
+          <w:iCs/>
+          <w:color w:val="404040"/>
+        </w:rPr>
+        <w:t xml:space="preserve">In simple terms: Whether a dataset has 4 rows or 3,000 rows makes no difference. The pipeline samples data before processing, so size is irrelevant.</w:t>
       </w:r>
     </w:p>
     <w:p/>
@@ -2501,6 +2551,16 @@
         <w:t>Strong-tier domains achieve mean PV accuracy of 38.4% compared to 10.5% for Moderate and 4.7% for Weak. The gap between Strong and Weak tiers confirms that schema coverage is a key predictor of automated schematization success. Supported.</w:t>
       </w:r>
     </w:p>
+    <w:p>
+      <w:r>
+        <w:rPr>
+          <w:i/>
+          <w:iCs/>
+          <w:color w:val="404040"/>
+        </w:rPr>
+        <w:t xml:space="preserve">In simple terms: Think of it like a translation dictionary. Topics with hundreds of entries translate well. Topics with thin dictionaries translate poorly, regardless of table quality.</w:t>
+      </w:r>
+    </w:p>
     <w:p/>
     <w:p>
       <w:pPr>
@@ -4180,6 +4240,16 @@
     </w:p>
     <w:p>
       <w:r>
+        <w:rPr>
+          <w:i/>
+          <w:iCs/>
+          <w:color w:val="404040"/>
+        </w:rPr>
+        <w:t xml:space="preserve">In simple terms: To improve results, expand the vocabulary for poorly-covered topics. Table size and complexity are not the problem.</w:t>
+      </w:r>
+    </w:p>
+    <w:p>
+      <w:r>
         <w:br w:type="page"/>
       </w:r>
     </w:p>
@@ -4411,6 +4481,16 @@
       </w:r>
     </w:p>
     <w:p>
+      <w:r>
+        <w:rPr>
+          <w:i/>
+          <w:iCs/>
+          <w:color w:val="404040"/>
+        </w:rPr>
+        <w:t xml:space="preserve">In simple terms: Only 28 of our 48 answer keys actually work. The other 20 have technical issues, so our scores may be worse than reality for those.</w:t>
+      </w:r>
+    </w:p>
+    <w:p>
       <w:pPr>
         <w:pStyle w:val="Heading2"/>
       </w:pPr>
@@ -4594,6 +4674,16 @@
     <w:p>
       <w:r>
         <w:t>However, the PV accuracy numbers for the 10 broken datasets should be interpreted with caution. Their accuracy scores may understate true pipeline performance if the ground truth PVMAP itself cannot produce valid output against the available input data.</w:t>
+      </w:r>
+    </w:p>
+    <w:p>
+      <w:r>
+        <w:rPr>
+          <w:i/>
+          <w:iCs/>
+          <w:color w:val="404040"/>
+        </w:rPr>
+        <w:t xml:space="preserve">In simple terms: The main conclusions still hold. But accuracy numbers for the 10 broken datasets should be taken with a grain of salt.</w:t>
       </w:r>
     </w:p>
     <w:p>

</xml_diff>